<commit_message>
Revert "01 git basics hw"
</commit_message>
<xml_diff>
--- a/miniproject3/Report for miniproject 3.docx
+++ b/miniproject3/Report for miniproject 3.docx
@@ -49,7 +49,7 @@
           <w:sz w:val="40"/>
           <w:szCs w:val="40"/>
         </w:rPr>
-        <w:t>3</w:t>
+        <w:t>2</w:t>
       </w:r>
     </w:p>
     <w:p>
@@ -2445,31 +2445,31 @@
           <w:sz w:val="28"/>
           <w:szCs w:val="28"/>
         </w:rPr>
-        <w:t xml:space="preserve"> (10% of the total volume</w:t>
-      </w:r>
-      <w:r>
-        <w:rPr>
-          <w:rFonts w:ascii="Times New Roman" w:hAnsi="Times New Roman" w:cs="Times New Roman"/>
-          <w:sz w:val="28"/>
-          <w:szCs w:val="28"/>
-        </w:rPr>
-        <w:t>)</w:t>
-      </w:r>
-      <w:r>
-        <w:rPr>
-          <w:rFonts w:ascii="Times New Roman" w:hAnsi="Times New Roman" w:cs="Times New Roman"/>
-          <w:sz w:val="32"/>
-          <w:szCs w:val="32"/>
-        </w:rPr>
-        <w:t xml:space="preserve"> and</w:t>
-      </w:r>
-      <w:r>
-        <w:rPr>
-          <w:rFonts w:ascii="Times New Roman" w:hAnsi="Times New Roman" w:cs="Times New Roman"/>
-          <w:sz w:val="32"/>
-          <w:szCs w:val="32"/>
-        </w:rPr>
-        <w:t xml:space="preserve"> will stop pumping water when volume is greater than </w:t>
+        <w:t xml:space="preserve"> (10% of the total volume)</w:t>
+      </w:r>
+      <w:r>
+        <w:rPr>
+          <w:rFonts w:ascii="Times New Roman" w:hAnsi="Times New Roman" w:cs="Times New Roman"/>
+          <w:sz w:val="32"/>
+          <w:szCs w:val="32"/>
+        </w:rPr>
+        <w:t>,</w:t>
+      </w:r>
+      <w:r>
+        <w:rPr>
+          <w:rFonts w:ascii="Times New Roman" w:hAnsi="Times New Roman" w:cs="Times New Roman"/>
+          <w:sz w:val="32"/>
+          <w:szCs w:val="32"/>
+        </w:rPr>
+        <w:t xml:space="preserve"> </w:t>
+      </w:r>
+      <w:r>
+        <w:rPr>
+          <w:rFonts w:ascii="Times New Roman" w:hAnsi="Times New Roman" w:cs="Times New Roman"/>
+          <w:sz w:val="32"/>
+          <w:szCs w:val="32"/>
+        </w:rPr>
+        <w:t xml:space="preserve">and will stop pumping water when volume is greater than </w:t>
       </w:r>
       <w:r>
         <w:rPr>

</xml_diff>